<commit_message>
Refine paper wording and references
Agent-Logs-Url: https://github.com/haxscrz/workout_posture_ai/sessions/1c84508b-c9d1-41db-8e5e-e0c6c6683740

Co-authored-by: haxscrz <179999715+haxscrz@users.noreply.github.com>
</commit_message>
<xml_diff>
--- a/paper/technical_paper.docx
+++ b/paper/technical_paper.docx
@@ -7,7 +7,7 @@
         <w:pStyle w:val="Title"/>
       </w:pPr>
       <w:r>
-        <w:t xml:space="preserve">Workout Posture AI: Real-Time Squat Form Assessment with MediaPipe Landmarks and Temporal Conv1D Modeling</w:t>
+        <w:t xml:space="preserve">Real-Time Squat Form Assessment Using MediaPipe and Temporal Conv1D Modeling</w:t>
       </w:r>
     </w:p>
     <w:p>
@@ -715,27 +715,7 @@
         <w:pStyle w:val="FirstParagraph"/>
       </w:pPr>
       <w:r>
-        <w:t xml:space="preserve">The learned classifier operates on sliding windows of 15 frames (</w:t>
-      </w:r>
-      <m:oMath>
-        <m:r>
-          <m:t>15</m:t>
-        </m:r>
-        <m:r>
-          <m:rPr>
-            <m:sty m:val="p"/>
-          </m:rPr>
-          <m:t>×</m:t>
-        </m:r>
-        <m:r>
-          <m:t>15</m:t>
-        </m:r>
-      </m:oMath>
-      <w:r>
-        <w:t xml:space="preserve"> </w:t>
-      </w:r>
-      <w:r>
-        <w:t xml:space="preserve">input tensor: window length</w:t>
+        <w:t xml:space="preserve">The learned classifier operates on sliding windows of 15 frames (15 frames</w:t>
       </w:r>
       <w:r>
         <w:t xml:space="preserve"> </w:t>
@@ -752,7 +732,7 @@
         <w:t xml:space="preserve"> </w:t>
       </w:r>
       <w:r>
-        <w:t xml:space="preserve">feature count). The model stacks three Conv1D blocks (64, 128, 64 filters) with batch normalization, max pooling, and global average pooling. A dense layer with dropout (0.4) precedes the softmax output over seven classes (correct + six error classes). This architecture captures short-term temporal dynamics (e.g., knee collapse trends) while maintaining low latency for real-time feedback. The design follows evidence that temporal convolutions are competitive for sequence modeling in compact settings</w:t>
+        <w:t xml:space="preserve">15 features per frame). The model stacks three Conv1D blocks (64, 128, 64 filters) with batch normalization, max pooling, and global average pooling. A dense layer with dropout (0.4) precedes the softmax output over seven classes (correct + six error classes). This architecture captures short-term temporal dynamics (e.g., knee collapse trends) while maintaining low latency for real-time feedback. The design follows evidence that temporal convolutions are competitive for sequence modeling in compact settings</w:t>
       </w:r>
       <w:r>
         <w:t xml:space="preserve"> </w:t>
@@ -939,7 +919,7 @@
         <w:pStyle w:val="FirstParagraph"/>
       </w:pPr>
       <w:r>
-        <w:t xml:space="preserve">The repository ships with a pretrained model reporting 97.4% validation accuracy, computed from the training pipeline’s 20% validation split (as logged during training). While this metric indicates strong separation across the seven classes, the evaluation is limited by the scope and diversity of the available video dataset. Future work should include cross-subject validation, multi-environment testing, and comparisons with motion-capture ground truth to more rigorously quantify accuracy and biomechanical fidelity.</w:t>
+        <w:t xml:space="preserve">The repository ships with a pretrained model reporting 97.4% validation accuracy, computed from the training pipeline’s 20% validation split and reported in the project README for the bundled model. While this metric indicates strong separation across the seven classes, the evaluation is limited by the scope and diversity of the available video dataset. Future work should include cross-subject validation, multi-environment testing, and comparisons with motion-capture ground truth to more rigorously quantify accuracy and biomechanical fidelity.</w:t>
       </w:r>
     </w:p>
     <w:bookmarkEnd w:id="18"/>

</xml_diff>

<commit_message>
Clarify smoothing and evaluation context
Agent-Logs-Url: https://github.com/haxscrz/workout_posture_ai/sessions/1c84508b-c9d1-41db-8e5e-e0c6c6683740

Co-authored-by: haxscrz <179999715+haxscrz@users.noreply.github.com>
</commit_message>
<xml_diff>
--- a/paper/technical_paper.docx
+++ b/paper/technical_paper.docx
@@ -499,7 +499,7 @@
         </m:r>
       </m:oMath>
       <w:r>
-        <w:t xml:space="preserve">, reducing jitter while preserving responsiveness.</w:t>
+        <w:t xml:space="preserve">; this value was selected empirically in the project configuration to balance jitter reduction with low-latency responsiveness and can be tuned for different camera conditions.</w:t>
       </w:r>
     </w:p>
     <w:p>
@@ -919,7 +919,7 @@
         <w:pStyle w:val="FirstParagraph"/>
       </w:pPr>
       <w:r>
-        <w:t xml:space="preserve">The repository ships with a pretrained model reporting 97.4% validation accuracy, computed from the training pipeline’s 20% validation split and reported in the project README for the bundled model. While this metric indicates strong separation across the seven classes, the evaluation is limited by the scope and diversity of the available video dataset. Future work should include cross-subject validation, multi-environment testing, and comparisons with motion-capture ground truth to more rigorously quantify accuracy and biomechanical fidelity.</w:t>
+        <w:t xml:space="preserve">The repository ships with a pretrained model reporting 97.4% validation accuracy, computed from the training pipeline’s 20% validation split and reported in the project README for the bundled model. The repository does not include a published dataset size or per-class breakdown, so this metric should be interpreted as a single summary value rather than a comprehensive evaluation. While the reported accuracy indicates strong separation across the seven classes, the evaluation remains limited by the scope and diversity of the available video dataset. Future work should include cross-subject validation, multi-environment testing, and comparisons with motion-capture ground truth to more rigorously quantify accuracy and biomechanical fidelity.</w:t>
       </w:r>
     </w:p>
     <w:bookmarkEnd w:id="18"/>

</xml_diff>

<commit_message>
Polish evaluation and discussion text
Agent-Logs-Url: https://github.com/haxscrz/workout_posture_ai/sessions/1c84508b-c9d1-41db-8e5e-e0c6c6683740

Co-authored-by: haxscrz <179999715+haxscrz@users.noreply.github.com>
</commit_message>
<xml_diff>
--- a/paper/technical_paper.docx
+++ b/paper/technical_paper.docx
@@ -499,7 +499,7 @@
         </m:r>
       </m:oMath>
       <w:r>
-        <w:t xml:space="preserve">; this value was selected empirically in the project configuration to balance jitter reduction with low-latency responsiveness and can be tuned for different camera conditions.</w:t>
+        <w:t xml:space="preserve">. This value was selected empirically in the project configuration to balance jitter reduction with low-latency responsiveness and can be tuned for different camera conditions.</w:t>
       </w:r>
     </w:p>
     <w:p>
@@ -715,7 +715,7 @@
         <w:pStyle w:val="FirstParagraph"/>
       </w:pPr>
       <w:r>
-        <w:t xml:space="preserve">The learned classifier operates on sliding windows of 15 frames (15 frames</w:t>
+        <w:t xml:space="preserve">The learned classifier operates on sliding windows (15 frames</w:t>
       </w:r>
       <w:r>
         <w:t xml:space="preserve"> </w:t>
@@ -919,7 +919,7 @@
         <w:pStyle w:val="FirstParagraph"/>
       </w:pPr>
       <w:r>
-        <w:t xml:space="preserve">The repository ships with a pretrained model reporting 97.4% validation accuracy, computed from the training pipeline’s 20% validation split and reported in the project README for the bundled model. The repository does not include a published dataset size or per-class breakdown, so this metric should be interpreted as a single summary value rather than a comprehensive evaluation. While the reported accuracy indicates strong separation across the seven classes, the evaluation remains limited by the scope and diversity of the available video dataset. Future work should include cross-subject validation, multi-environment testing, and comparisons with motion-capture ground truth to more rigorously quantify accuracy and biomechanical fidelity.</w:t>
+        <w:t xml:space="preserve">The repository ships with a pretrained model reporting 97.4% validation accuracy, computed from the training pipeline’s 20% validation split and reported in the project README for the bundled model. This provides a strong baseline for seven-class discrimination on the curated training set. The repository does not publish dataset size or per-class metrics, so broader validation and more detailed reporting remain future work.</w:t>
       </w:r>
     </w:p>
     <w:bookmarkEnd w:id="18"/>
@@ -951,7 +951,7 @@
         <w:t xml:space="preserve"> </w:t>
       </w:r>
       <w:r>
-        <w:t xml:space="preserve">from MediaPipe), which may be less stable than multi-camera or depth sensors. Occlusions or partial visibility can reduce reliability, requiring explicit visibility checks. The dataset used for training is limited to curated squat videos and may not cover broader variations in camera angle, body type, or equipment. These constraints motivate future expansion of training data, sensor fusion, and adaptive personalization.</w:t>
+        <w:t xml:space="preserve">from MediaPipe), which may be less stable than multi-camera or depth sensors. Occlusions or partial visibility can reduce reliability, requiring explicit visibility checks. The dataset used for training is limited to curated squat videos and may not cover broader variations in camera angle, body type, or equipment. These constraints motivate future expansion of training data, cross-subject validation, multi-environment testing, motion-capture comparisons, sensor fusion, and adaptive personalization.</w:t>
       </w:r>
     </w:p>
     <w:bookmarkEnd w:id="19"/>

</xml_diff>

<commit_message>
Tighten smoothing and evaluation wording
Agent-Logs-Url: https://github.com/haxscrz/workout_posture_ai/sessions/1c84508b-c9d1-41db-8e5e-e0c6c6683740

Co-authored-by: haxscrz <179999715+haxscrz@users.noreply.github.com>
</commit_message>
<xml_diff>
--- a/paper/technical_paper.docx
+++ b/paper/technical_paper.docx
@@ -499,7 +499,22 @@
         </m:r>
       </m:oMath>
       <w:r>
-        <w:t xml:space="preserve">. This value was selected empirically in the project configuration to balance jitter reduction with low-latency responsiveness and can be tuned for different camera conditions.</w:t>
+        <w:t xml:space="preserve">. The smoothing factor is defined in</w:t>
+      </w:r>
+      <w:r>
+        <w:t xml:space="preserve"> </w:t>
+      </w:r>
+      <w:r>
+        <w:rPr>
+          <w:rStyle w:val="VerbatimChar"/>
+        </w:rPr>
+        <w:t xml:space="preserve">config.py</w:t>
+      </w:r>
+      <w:r>
+        <w:t xml:space="preserve"> </w:t>
+      </w:r>
+      <w:r>
+        <w:t xml:space="preserve">to provide moderate jitter reduction while maintaining responsive feedback, and it can be adjusted for different camera conditions.</w:t>
       </w:r>
     </w:p>
     <w:p>
@@ -919,7 +934,7 @@
         <w:pStyle w:val="FirstParagraph"/>
       </w:pPr>
       <w:r>
-        <w:t xml:space="preserve">The repository ships with a pretrained model reporting 97.4% validation accuracy, computed from the training pipeline’s 20% validation split and reported in the project README for the bundled model. This provides a strong baseline for seven-class discrimination on the curated training set. The repository does not publish dataset size or per-class metrics, so broader validation and more detailed reporting remain future work.</w:t>
+        <w:t xml:space="preserve">The repository ships with a pretrained model reporting 97.4% validation accuracy, computed from the training pipeline’s 20% validation split and reported in the project README for the bundled model. This provides a strong baseline for seven-class discrimination on the available training videos. The repository does not publish dataset size or per-class metrics, so broader validation and more detailed reporting remain future work.</w:t>
       </w:r>
     </w:p>
     <w:bookmarkEnd w:id="18"/>

</xml_diff>

<commit_message>
Update paper to 2021+ citations and shorter length
Agent-Logs-Url: https://github.com/haxscrz/workout_posture_ai/sessions/442d0c9c-7923-41d6-8af0-5687a2bbe693

Co-authored-by: haxscrz <179999715+haxscrz@users.noreply.github.com>
</commit_message>
<xml_diff>
--- a/paper/technical_paper.docx
+++ b/paper/technical_paper.docx
@@ -46,7 +46,7 @@
         <w:pStyle w:val="Abstract"/>
       </w:pPr>
       <w:r>
-        <w:t xml:space="preserve">This paper presents Workout Posture AI, a real-time squat form assessment system that combines MediaPipe pose estimation with a temporal Conv1D classifier and rule-based biomechanical checks. The system targets six common squat errors (forward lean, heel rise, knee cave, knees over toes, shallow depth, and uneven weight) and provides immediate visual feedback, rep counting, and quality scoring. We describe the complete pipeline implemented in the repository: pose capture, landmark smoothing, body-size-invariant feature extraction, temporal windowing, a Conv1D classification model, and a rule engine that encodes biomechanics-inspired thresholds. The training pipeline processes labeled squat videos, applies augmentation, and balances classes for robust learning. The resulting system operates on live camera feeds or prerecorded videos, delivering explainable feedback and real-time coaching without external sensors.</w:t>
+        <w:t xml:space="preserve">This paper presents Workout Posture AI, a real-time squat form assessment system that combines pose estimation, a temporal Conv1D classifier, and rule-based biomechanical checks. The system targets six common squat errors (forward lean, heel rise, knee cave, knees over toes, shallow depth, and uneven weight) and provides immediate visual feedback, rep counting, and quality scoring. We describe the repository pipeline: landmark smoothing, body-size-invariant feature extraction, sliding-window inference, the training workflow, and the real-time user interface. The resulting system operates on live camera feeds or prerecorded videos and delivers explainable feedback without external sensors.</w:t>
       </w:r>
     </w:p>
     <w:bookmarkStart w:id="9" w:name="introduction"/>
@@ -63,16 +63,25 @@
         <w:pStyle w:val="FirstParagraph"/>
       </w:pPr>
       <w:r>
-        <w:t xml:space="preserve">Proper squat technique is fundamental for performance and injury prevention, yet common deviations such as forward trunk lean, knee valgus, and insufficient depth can increase joint loading and reduce training efficacy. Biomechanical analyses of the squat emphasize the influence of depth, trunk position, and joint alignment on knee and hip loading</w:t>
-      </w:r>
-      <w:r>
-        <w:t xml:space="preserve"> </w:t>
-      </w:r>
-      <w:r>
-        <w:t xml:space="preserve">(Escamilla 2010; Hartmann et al. 2013; Caterisano et al. 2002)</w:t>
-      </w:r>
-      <w:r>
-        <w:t xml:space="preserve">. At the same time, low-cost camera-based feedback systems can increase adherence and accessibility compared to laboratory motion capture. Workout Posture AI addresses this gap with a real-time, camera-only posture assessment tool that detects form errors, counts repetitions, and scores rep quality for immediate coaching.</w:t>
+        <w:t xml:space="preserve">Proper squat technique is fundamental for performance and injury prevention, yet deviations such as forward trunk lean and dynamic knee valgus can increase joint loading and reduce training efficacy. Recent analyses of dynamic knee valgus during squat-based tasks highlight muscle activation patterns and alignment risks that inform coaching feedback</w:t>
+      </w:r>
+      <w:r>
+        <w:t xml:space="preserve"> </w:t>
+      </w:r>
+      <w:r>
+        <w:t xml:space="preserve">(Khou et al. 2024)</w:t>
+      </w:r>
+      <w:r>
+        <w:t xml:space="preserve">. In parallel, markerless motion capture reviews show growing clinical adoption of camera-based movement assessment</w:t>
+      </w:r>
+      <w:r>
+        <w:t xml:space="preserve"> </w:t>
+      </w:r>
+      <w:r>
+        <w:t xml:space="preserve">(Lam et al. 2023)</w:t>
+      </w:r>
+      <w:r>
+        <w:t xml:space="preserve">. Workout Posture AI addresses this gap with a real-time, camera-only posture assessment tool that detects form errors, counts repetitions, and scores rep quality for immediate coaching.</w:t>
       </w:r>
     </w:p>
     <w:p>
@@ -80,40 +89,7 @@
         <w:pStyle w:val="BodyText"/>
       </w:pPr>
       <w:r>
-        <w:t xml:space="preserve">The project integrates MediaPipe pose estimation</w:t>
-      </w:r>
-      <w:r>
-        <w:t xml:space="preserve"> </w:t>
-      </w:r>
-      <w:r>
-        <w:t xml:space="preserve">(</w:t>
-      </w:r>
-      <w:r>
-        <w:t xml:space="preserve">Lugaresi et al.</w:t>
-      </w:r>
-      <w:r>
-        <w:t xml:space="preserve"> </w:t>
-      </w:r>
-      <w:r>
-        <w:t xml:space="preserve">2019)</w:t>
-      </w:r>
-      <w:r>
-        <w:t xml:space="preserve"> </w:t>
-      </w:r>
-      <w:r>
-        <w:t xml:space="preserve">with a temporal Conv1D classifier inspired by sequence modeling research</w:t>
-      </w:r>
-      <w:r>
-        <w:t xml:space="preserve"> </w:t>
-      </w:r>
-      <w:r>
-        <w:t xml:space="preserve">(Bai et al. 2018)</w:t>
-      </w:r>
-      <w:r>
-        <w:t xml:space="preserve"> </w:t>
-      </w:r>
-      <w:r>
-        <w:t xml:space="preserve">and overlays rule-based checks grounded in biomechanics literature. The contributions of this work are: (1) a complete end-to-end pipeline for squat analysis implemented in Python; (2) a body-size-invariant feature representation with 15 interpretable features; (3) a hybrid inference approach combining deterministic rules and a learned temporal model; and (4) a real-time user interface with rep counting, quality scoring, and visual joint feedback.</w:t>
+        <w:t xml:space="preserve">The project integrates real-time pose estimation with a temporal Conv1D classifier and overlays rule-based checks grounded in recent biomechanics literature. The contributions of this work are: (1) a complete end-to-end pipeline for squat analysis implemented in Python; (2) a body-size-invariant feature representation with 15 interpretable features; (3) a hybrid inference approach combining deterministic rules and a learned temporal model; and (4) a real-time user interface with rep counting, quality scoring, and visual joint feedback.</w:t>
       </w:r>
     </w:p>
     <w:bookmarkEnd w:id="9"/>
@@ -141,73 +117,16 @@
         <w:t xml:space="preserve"> </w:t>
       </w:r>
       <w:r>
-        <w:t xml:space="preserve">Multi-person pose estimation systems such as OpenPose</w:t>
-      </w:r>
-      <w:r>
-        <w:t xml:space="preserve"> </w:t>
-      </w:r>
-      <w:r>
-        <w:t xml:space="preserve">(Cao et al. 2017)</w:t>
-      </w:r>
-      <w:r>
-        <w:t xml:space="preserve"> </w:t>
-      </w:r>
-      <w:r>
-        <w:t xml:space="preserve">and Convolutional Pose Machines</w:t>
-      </w:r>
-      <w:r>
-        <w:t xml:space="preserve"> </w:t>
-      </w:r>
-      <w:r>
-        <w:t xml:space="preserve">(Wei et al. 2016)</w:t>
-      </w:r>
-      <w:r>
-        <w:t xml:space="preserve"> </w:t>
-      </w:r>
-      <w:r>
-        <w:t xml:space="preserve">enabled reliable 2D joint detection in unconstrained images. MediaPipe</w:t>
-      </w:r>
-      <w:r>
-        <w:t xml:space="preserve"> </w:t>
-      </w:r>
-      <w:r>
-        <w:t xml:space="preserve">(</w:t>
-      </w:r>
-      <w:r>
-        <w:t xml:space="preserve">Lugaresi et al.</w:t>
-      </w:r>
-      <w:r>
-        <w:t xml:space="preserve"> </w:t>
-      </w:r>
-      <w:r>
-        <w:t xml:space="preserve">2019)</w:t>
-      </w:r>
-      <w:r>
-        <w:t xml:space="preserve"> </w:t>
-      </w:r>
-      <w:r>
-        <w:t xml:space="preserve">and BlazePose</w:t>
-      </w:r>
-      <w:r>
-        <w:t xml:space="preserve"> </w:t>
-      </w:r>
-      <w:r>
-        <w:t xml:space="preserve">(</w:t>
-      </w:r>
-      <w:r>
-        <w:t xml:space="preserve">Bazarevsky et al.</w:t>
-      </w:r>
-      <w:r>
-        <w:t xml:space="preserve"> </w:t>
-      </w:r>
-      <w:r>
-        <w:t xml:space="preserve">2020)</w:t>
-      </w:r>
-      <w:r>
-        <w:t xml:space="preserve"> </w:t>
-      </w:r>
-      <w:r>
-        <w:t xml:space="preserve">extended these ideas to efficient, on-device pipelines for real-time inference. Workout Posture AI builds on MediaPipe Pose (33 landmarks) to provide high-frequency body tracking with sufficient accuracy for exercise feedback.</w:t>
+        <w:t xml:space="preserve">Recent pose estimation models and surveys demonstrate strong accuracy and practical deployment for real-time 2D keypoint tracking</w:t>
+      </w:r>
+      <w:r>
+        <w:t xml:space="preserve"> </w:t>
+      </w:r>
+      <w:r>
+        <w:t xml:space="preserve">(Xu et al. 2022; Zhou et al. 2023)</w:t>
+      </w:r>
+      <w:r>
+        <w:t xml:space="preserve">. Workout Posture AI builds on these advances by using a lightweight pose pipeline to provide high-frequency body tracking for exercise feedback.</w:t>
       </w:r>
     </w:p>
     <w:p>
@@ -225,16 +144,7 @@
         <w:t xml:space="preserve"> </w:t>
       </w:r>
       <w:r>
-        <w:t xml:space="preserve">Temporal convolutional networks and related Conv1D models are effective for sequence modeling and offer lower latency than recurrent architectures</w:t>
-      </w:r>
-      <w:r>
-        <w:t xml:space="preserve"> </w:t>
-      </w:r>
-      <w:r>
-        <w:t xml:space="preserve">(Bai et al. 2018)</w:t>
-      </w:r>
-      <w:r>
-        <w:t xml:space="preserve">. Our approach leverages a compact Conv1D network over short windows of pose features to classify squat form in real time.</w:t>
+        <w:t xml:space="preserve">Our approach leverages a compact Conv1D network over short windows of pose features to classify squat form in real time while maintaining low latency.</w:t>
       </w:r>
     </w:p>
     <w:p>
@@ -252,16 +162,16 @@
         <w:t xml:space="preserve"> </w:t>
       </w:r>
       <w:r>
-        <w:t xml:space="preserve">Prior work emphasizes the effect of squat depth and trunk position on joint loading and muscle activation</w:t>
-      </w:r>
-      <w:r>
-        <w:t xml:space="preserve"> </w:t>
-      </w:r>
-      <w:r>
-        <w:t xml:space="preserve">(Escamilla 2010; Hartmann et al. 2013; Caterisano et al. 2002)</w:t>
-      </w:r>
-      <w:r>
-        <w:t xml:space="preserve">. These findings inform the rule-based thresholds used in our system (e.g., forward lean, shallow depth, knee valgus), complementing learned classification for robust coaching.</w:t>
+        <w:t xml:space="preserve">Recent work on dynamic knee valgus during squat tasks motivates rule-based thresholds used in our system (e.g., forward lean, shallow depth, knee valgus), complementing learned classification for robust coaching</w:t>
+      </w:r>
+      <w:r>
+        <w:t xml:space="preserve"> </w:t>
+      </w:r>
+      <w:r>
+        <w:t xml:space="preserve">(Khou et al. 2024)</w:t>
+      </w:r>
+      <w:r>
+        <w:t xml:space="preserve">.</w:t>
       </w:r>
     </w:p>
     <w:bookmarkEnd w:id="10"/>
@@ -279,141 +189,7 @@
         <w:pStyle w:val="FirstParagraph"/>
       </w:pPr>
       <w:r>
-        <w:t xml:space="preserve">Workout Posture AI is organized into a modular pipeline (Figure </w:t>
-      </w:r>
-      <w:hyperlink w:anchor="fig:pipeline">
-        <w:r>
-          <w:rPr>
-            <w:rStyle w:val="Hyperlink"/>
-          </w:rPr>
-          <w:t xml:space="preserve">[fig:pipeline]</w:t>
-        </w:r>
-      </w:hyperlink>
-      <w:r>
-        <w:t xml:space="preserve"> </w:t>
-      </w:r>
-      <w:r>
-        <w:t xml:space="preserve">description provided in text). The key modules in the repository are:</w:t>
-      </w:r>
-      <w:r>
-        <w:t xml:space="preserve"> </w:t>
-      </w:r>
-      <w:r>
-        <w:rPr>
-          <w:rStyle w:val="VerbatimChar"/>
-        </w:rPr>
-        <w:t xml:space="preserve">config.py</w:t>
-      </w:r>
-      <w:r>
-        <w:t xml:space="preserve"> </w:t>
-      </w:r>
-      <w:r>
-        <w:t xml:space="preserve">for thresholds and paths,</w:t>
-      </w:r>
-      <w:r>
-        <w:t xml:space="preserve"> </w:t>
-      </w:r>
-      <w:r>
-        <w:rPr>
-          <w:rStyle w:val="VerbatimChar"/>
-        </w:rPr>
-        <w:t xml:space="preserve">utils.py</w:t>
-      </w:r>
-      <w:r>
-        <w:t xml:space="preserve"> </w:t>
-      </w:r>
-      <w:r>
-        <w:t xml:space="preserve">for math and smoothing,</w:t>
-      </w:r>
-      <w:r>
-        <w:t xml:space="preserve"> </w:t>
-      </w:r>
-      <w:r>
-        <w:rPr>
-          <w:rStyle w:val="VerbatimChar"/>
-        </w:rPr>
-        <w:t xml:space="preserve">features.py</w:t>
-      </w:r>
-      <w:r>
-        <w:t xml:space="preserve"> </w:t>
-      </w:r>
-      <w:r>
-        <w:t xml:space="preserve">for feature extraction,</w:t>
-      </w:r>
-      <w:r>
-        <w:t xml:space="preserve"> </w:t>
-      </w:r>
-      <w:r>
-        <w:rPr>
-          <w:rStyle w:val="VerbatimChar"/>
-        </w:rPr>
-        <w:t xml:space="preserve">rules.py</w:t>
-      </w:r>
-      <w:r>
-        <w:t xml:space="preserve"> </w:t>
-      </w:r>
-      <w:r>
-        <w:t xml:space="preserve">for deterministic form checks,</w:t>
-      </w:r>
-      <w:r>
-        <w:t xml:space="preserve"> </w:t>
-      </w:r>
-      <w:r>
-        <w:rPr>
-          <w:rStyle w:val="VerbatimChar"/>
-        </w:rPr>
-        <w:t xml:space="preserve">model.py</w:t>
-      </w:r>
-      <w:r>
-        <w:t xml:space="preserve"> </w:t>
-      </w:r>
-      <w:r>
-        <w:t xml:space="preserve">for the Conv1D architecture,</w:t>
-      </w:r>
-      <w:r>
-        <w:t xml:space="preserve"> </w:t>
-      </w:r>
-      <w:r>
-        <w:rPr>
-          <w:rStyle w:val="VerbatimChar"/>
-        </w:rPr>
-        <w:t xml:space="preserve">train.py</w:t>
-      </w:r>
-      <w:r>
-        <w:t xml:space="preserve"> </w:t>
-      </w:r>
-      <w:r>
-        <w:t xml:space="preserve">for dataset processing and training,</w:t>
-      </w:r>
-      <w:r>
-        <w:t xml:space="preserve"> </w:t>
-      </w:r>
-      <w:r>
-        <w:rPr>
-          <w:rStyle w:val="VerbatimChar"/>
-        </w:rPr>
-        <w:t xml:space="preserve">analyzer.py</w:t>
-      </w:r>
-      <w:r>
-        <w:t xml:space="preserve"> </w:t>
-      </w:r>
-      <w:r>
-        <w:t xml:space="preserve">for real-time inference and UI overlays, and</w:t>
-      </w:r>
-      <w:r>
-        <w:t xml:space="preserve"> </w:t>
-      </w:r>
-      <w:r>
-        <w:rPr>
-          <w:rStyle w:val="VerbatimChar"/>
-        </w:rPr>
-        <w:t xml:space="preserve">main.py</w:t>
-      </w:r>
-      <w:r>
-        <w:t xml:space="preserve"> </w:t>
-      </w:r>
-      <w:r>
-        <w:t xml:space="preserve">for CLI entry points. The system accepts video from a webcam, IP camera, or file, performs pose estimation with MediaPipe, computes features, evaluates rules and the ML model, and renders feedback overlays.</w:t>
+        <w:t xml:space="preserve">Workout Posture AI is organized into a modular pipeline. Core modules include configuration thresholds, feature extraction, a rule engine, the Conv1D model, the training pipeline, and the real-time analyzer/UI. The system accepts video from a webcam, IP camera, or file, performs pose estimation, computes features, evaluates rules and the ML model, and renders feedback overlays.</w:t>
       </w:r>
     </w:p>
     <w:bookmarkEnd w:id="11"/>
@@ -431,7 +207,7 @@
         <w:pStyle w:val="FirstParagraph"/>
       </w:pPr>
       <w:r>
-        <w:t xml:space="preserve">Each frame is processed by MediaPipe Pose, yielding 33 normalized landmarks with visibility scores. Landmarks are converted to a list of dictionaries containing</w:t>
+        <w:t xml:space="preserve">Each frame is processed by a real-time pose estimator, yielding 33 normalized landmarks with visibility scores. Landmarks are converted to a list of dictionaries containing</w:t>
       </w:r>
       <w:r>
         <w:t xml:space="preserve"> </w:t>
@@ -522,7 +298,7 @@
         <w:pStyle w:val="BodyText"/>
       </w:pPr>
       <w:r>
-        <w:t xml:space="preserve">Body dimensions are estimated from normalized coordinates. Body height is defined as the nose-to-ankle vertical distance, and body width as shoulder-to-shoulder horizontal distance, with safe fallbacks for partial visibility. These measurements normalize distances and ratios to achieve body-size invariance, enabling a single model to generalize across users with different anthropometry.</w:t>
+        <w:t xml:space="preserve">Body dimensions are estimated from normalized coordinates: body height as nose-to-ankle distance and body width as shoulder-to-shoulder distance, with fallbacks for partial visibility. These measurements normalize distances and ratios to achieve body-size invariance across users.</w:t>
       </w:r>
     </w:p>
     <w:bookmarkEnd w:id="12"/>
@@ -540,7 +316,7 @@
         <w:pStyle w:val="FirstParagraph"/>
       </w:pPr>
       <w:r>
-        <w:t xml:space="preserve">A 15-dimensional feature vector is extracted per frame and shared between training and inference to enforce feature parity. Features capture joint angles, relative distances, and symmetry measures, all normalized by body height or width. Examples include knee angles, trunk vertical angle, hip depth ratio, knee-forward ratio, and lateral hip shift. This representation balances interpretability with predictive power and is described in Appendix A.</w:t>
+        <w:t xml:space="preserve">A 15-dimensional feature vector is extracted per frame and shared between training and inference. Features capture joint angles, relative distances, and symmetry measures normalized by body height or width. This representation balances interpretability with predictive power and is described in Appendix A.</w:t>
       </w:r>
     </w:p>
     <w:bookmarkEnd w:id="13"/>
@@ -747,16 +523,7 @@
         <w:t xml:space="preserve"> </w:t>
       </w:r>
       <w:r>
-        <w:t xml:space="preserve">15 features per frame). The model stacks three Conv1D blocks (64, 128, 64 filters) with batch normalization, max pooling, and global average pooling. A dense layer with dropout (0.4) precedes the softmax output over seven classes (correct + six error classes). This architecture captures short-term temporal dynamics (e.g., knee collapse trends) while maintaining low latency for real-time feedback. The design follows evidence that temporal convolutions are competitive for sequence modeling in compact settings</w:t>
-      </w:r>
-      <w:r>
-        <w:t xml:space="preserve"> </w:t>
-      </w:r>
-      <w:r>
-        <w:t xml:space="preserve">(Bai et al. 2018)</w:t>
-      </w:r>
-      <w:r>
-        <w:t xml:space="preserve">.</w:t>
+        <w:t xml:space="preserve">15 features per frame). The model stacks three Conv1D blocks (64, 128, 64 filters) with batch normalization, max pooling, and global average pooling. A dense layer with dropout (0.4) precedes the softmax output over seven classes (correct + six error classes). This architecture captures short-term temporal dynamics (e.g., knee collapse trends) while maintaining low latency for real-time feedback.</w:t>
       </w:r>
     </w:p>
     <w:bookmarkEnd w:id="15"/>
@@ -789,27 +556,7 @@
         <w:t xml:space="preserve"> </w:t>
       </w:r>
       <w:r>
-        <w:t xml:space="preserve">and labeled via a filename-to-class mapping. The pipeline scans videos, extracts pose features, and builds overlapping windows (50% overlap) to increase sample count. Frames are subsampled at a configurable rate (default 2) to reduce redundancy. Horizontal mirroring is used for augmentation, with independent baseline heel calibration per mirrored sequence.</w:t>
-      </w:r>
-    </w:p>
-    <w:p>
-      <w:pPr>
-        <w:pStyle w:val="BodyText"/>
-      </w:pPr>
-      <w:r>
-        <w:t xml:space="preserve">Class imbalance is addressed with inverse-frequency weights. The model is trained using categorical cross-entropy with the Adam optimizer, initial learning rate 0.001, batch size 32, and 20% validation split. Early stopping (patience 15) and learning-rate reduction on plateau stabilize training. Training artifacts (</w:t>
-      </w:r>
-      <w:r>
-        <w:rPr>
-          <w:rStyle w:val="VerbatimChar"/>
-        </w:rPr>
-        <w:t xml:space="preserve">squat_model.keras</w:t>
-      </w:r>
-      <w:r>
-        <w:t xml:space="preserve"> </w:t>
-      </w:r>
-      <w:r>
-        <w:t xml:space="preserve">and class labels) are saved to the</w:t>
+        <w:t xml:space="preserve">and labeled via a filename-to-class mapping. The pipeline scans videos, extracts pose features, builds overlapping windows, subsamples frames for efficiency, and applies horizontal mirroring for augmentation. The model is trained with categorical cross-entropy, Adam optimization, early stopping, and learning-rate reduction; artifacts are saved to</w:t>
       </w:r>
       <w:r>
         <w:t xml:space="preserve"> </w:t>
@@ -824,7 +571,7 @@
         <w:t xml:space="preserve"> </w:t>
       </w:r>
       <w:r>
-        <w:t xml:space="preserve">directory for reuse in real-time inference.</w:t>
+        <w:t xml:space="preserve">for reuse in inference.</w:t>
       </w:r>
     </w:p>
     <w:bookmarkEnd w:id="16"/>
@@ -857,66 +604,7 @@
         <w:t xml:space="preserve"> </w:t>
       </w:r>
       <w:r>
-        <w:t xml:space="preserve">class. A finite-state machine tracks squat phases (WAITING</w:t>
-      </w:r>
-      <w:r>
-        <w:t xml:space="preserve"> </w:t>
-      </w:r>
-      <m:oMath>
-        <m:r>
-          <m:rPr>
-            <m:sty m:val="p"/>
-          </m:rPr>
-          <m:t>→</m:t>
-        </m:r>
-      </m:oMath>
-      <w:r>
-        <w:t xml:space="preserve"> </w:t>
-      </w:r>
-      <w:r>
-        <w:t xml:space="preserve">STANDING</w:t>
-      </w:r>
-      <w:r>
-        <w:t xml:space="preserve"> </w:t>
-      </w:r>
-      <m:oMath>
-        <m:r>
-          <m:rPr>
-            <m:sty m:val="p"/>
-          </m:rPr>
-          <m:t>→</m:t>
-        </m:r>
-      </m:oMath>
-      <w:r>
-        <w:t xml:space="preserve"> </w:t>
-      </w:r>
-      <w:r>
-        <w:t xml:space="preserve">SQUATTING</w:t>
-      </w:r>
-      <w:r>
-        <w:t xml:space="preserve"> </w:t>
-      </w:r>
-      <m:oMath>
-        <m:r>
-          <m:rPr>
-            <m:sty m:val="p"/>
-          </m:rPr>
-          <m:t>→</m:t>
-        </m:r>
-      </m:oMath>
-      <w:r>
-        <w:t xml:space="preserve"> </w:t>
-      </w:r>
-      <w:r>
-        <w:t xml:space="preserve">STANDING) using the hip-knee depth ratio. Each rep accumulates rule violations; issues persisting for at least 10 frames influence rep quality (good/fair/poor). The UI overlays a skeleton with color-coded joints, highlights current issues, displays rep counts and quality summary, and optionally shows ML predictions with confidence scores.</w:t>
-      </w:r>
-    </w:p>
-    <w:p>
-      <w:pPr>
-        <w:pStyle w:val="BodyText"/>
-      </w:pPr>
-      <w:r>
-        <w:t xml:space="preserve">The system supports live camera streams, IP webcams, and prerecorded video files, enabling deployment in home or gym environments. The ability to switch camera sources and reset counters provides practical usability for training sessions.</w:t>
+        <w:t xml:space="preserve">class. A finite-state machine tracks squat phases using the hip-knee depth ratio, while rule violations accumulated across frames determine rep quality (good/fair/poor). The UI overlays a skeleton with color-coded joints, highlights current issues, displays rep counts, and optionally shows ML predictions with confidence scores.</w:t>
       </w:r>
     </w:p>
     <w:bookmarkEnd w:id="17"/>
@@ -952,21 +640,7 @@
         <w:pStyle w:val="FirstParagraph"/>
       </w:pPr>
       <w:r>
-        <w:t xml:space="preserve">The hybrid design combines interpretability with statistical learning, which is advantageous for safety-critical coaching where users need actionable feedback. However, limitations remain. The system relies on 2D/monocular depth estimates (normalized</w:t>
-      </w:r>
-      <w:r>
-        <w:t xml:space="preserve"> </w:t>
-      </w:r>
-      <m:oMath>
-        <m:r>
-          <m:t>z</m:t>
-        </m:r>
-      </m:oMath>
-      <w:r>
-        <w:t xml:space="preserve"> </w:t>
-      </w:r>
-      <w:r>
-        <w:t xml:space="preserve">from MediaPipe), which may be less stable than multi-camera or depth sensors. Occlusions or partial visibility can reduce reliability, requiring explicit visibility checks. The dataset used for training is limited to curated squat videos and may not cover broader variations in camera angle, body type, or equipment. These constraints motivate future expansion of training data, cross-subject validation, multi-environment testing, motion-capture comparisons, sensor fusion, and adaptive personalization.</w:t>
+        <w:t xml:space="preserve">The hybrid design combines interpretability with statistical learning, which is advantageous for safety-critical coaching where users need actionable feedback. However, limitations remain. The system relies on 2D/monocular depth estimates, which may be less stable than multi-camera or depth sensors. Occlusions or partial visibility can reduce reliability, requiring explicit visibility checks. The dataset used for training is limited to curated squat videos and may not cover broader variations in camera angle, body type, or equipment. These constraints motivate future expansion of training data, cross-subject validation, multi-environment testing, motion-capture comparisons, sensor fusion, and adaptive personalization.</w:t>
       </w:r>
     </w:p>
     <w:bookmarkEnd w:id="19"/>
@@ -1816,7 +1490,7 @@
       </w:r>
     </w:p>
     <w:bookmarkEnd w:id="24"/>
-    <w:bookmarkStart w:id="42" w:name="bibliography"/>
+    <w:bookmarkStart w:id="34" w:name="bibliography"/>
     <w:p>
       <w:pPr>
         <w:pStyle w:val="Heading1"/>
@@ -1825,20 +1499,20 @@
         <w:t xml:space="preserve">References</w:t>
       </w:r>
     </w:p>
-    <w:bookmarkStart w:id="41" w:name="refs"/>
-    <w:bookmarkStart w:id="26" w:name="ref-bai2018empirical"/>
+    <w:bookmarkStart w:id="33" w:name="refs"/>
+    <w:bookmarkStart w:id="26" w:name="ref-khou2024valgus"/>
     <w:p>
       <w:pPr>
         <w:pStyle w:val="Bibliography"/>
       </w:pPr>
       <w:r>
-        <w:t xml:space="preserve">Bai, Shaojie, J. Zico Kolter, and Vladlen Koltun. 2018.</w:t>
-      </w:r>
-      <w:r>
-        <w:t xml:space="preserve"> </w:t>
-      </w:r>
-      <w:r>
-        <w:t xml:space="preserve">“An Empirical Evaluation of Generic Convolutional and Recurrent Networks for Sequence Modeling.”</w:t>
+        <w:t xml:space="preserve">Khou, Shima Bakhtiari, Farzaneh Saki, and Behdad Tahayori. 2024.</w:t>
+      </w:r>
+      <w:r>
+        <w:t xml:space="preserve"> </w:t>
+      </w:r>
+      <w:r>
+        <w:t xml:space="preserve">“Muscle Activation in the Lower Limb Muscles in Individuals with Dynamic Knee Valgus During Single-Leg and Overhead Squats: A Meta-Analysis Study.”</w:t>
       </w:r>
       <w:r>
         <w:t xml:space="preserve"> </w:t>
@@ -1848,10 +1522,13 @@
           <w:i/>
           <w:iCs/>
         </w:rPr>
-        <w:t xml:space="preserve">arXiv Preprint arXiv:1803.01271</w:t>
-      </w:r>
-      <w:r>
-        <w:t xml:space="preserve">.</w:t>
+        <w:t xml:space="preserve">BMC Musculoskeletal Disorders</w:t>
+      </w:r>
+      <w:r>
+        <w:t xml:space="preserve"> </w:t>
+      </w:r>
+      <w:r>
+        <w:t xml:space="preserve">25: 652.</w:t>
       </w:r>
       <w:r>
         <w:t xml:space="preserve"> </w:t>
@@ -1861,7 +1538,7 @@
           <w:rPr>
             <w:rStyle w:val="Hyperlink"/>
           </w:rPr>
-          <w:t xml:space="preserve">https://arxiv.org/abs/1803.01271</w:t>
+          <w:t xml:space="preserve">https://doi.org/10.1186/s12891-024-07759-6</w:t>
         </w:r>
       </w:hyperlink>
       <w:r>
@@ -1869,22 +1546,19 @@
       </w:r>
     </w:p>
     <w:bookmarkEnd w:id="26"/>
-    <w:bookmarkStart w:id="28" w:name="ref-bazarevsky2020blazepose"/>
+    <w:bookmarkStart w:id="28" w:name="ref-lam2023mmc"/>
     <w:p>
       <w:pPr>
         <w:pStyle w:val="Bibliography"/>
       </w:pPr>
       <w:r>
-        <w:t xml:space="preserve">Bazarevsky, Valentin, Ivan Grishchenko, Karthik Raveendran, Fan Zhang, Matthias Grundmann, et al.</w:t>
-      </w:r>
-      <w:r>
-        <w:t xml:space="preserve"> 2020.</w:t>
-      </w:r>
-      <w:r>
-        <w:t xml:space="preserve"> </w:t>
-      </w:r>
-      <w:r>
-        <w:t xml:space="preserve">“BlazePose: On-Device Real-Time Body Pose Tracking.”</w:t>
+        <w:t xml:space="preserve">Lam, Winnie W. T., Yuk Ming Tang, and Kenneth N. K. Fong. 2023.</w:t>
+      </w:r>
+      <w:r>
+        <w:t xml:space="preserve"> </w:t>
+      </w:r>
+      <w:r>
+        <w:t xml:space="preserve">“A Systematic Review of the Applications of Markerless Motion Capture (MMC) Technology for Clinical Measurement in Rehabilitation.”</w:t>
       </w:r>
       <w:r>
         <w:t xml:space="preserve"> </w:t>
@@ -1894,10 +1568,10 @@
           <w:i/>
           <w:iCs/>
         </w:rPr>
-        <w:t xml:space="preserve">arXiv Preprint arXiv:2006.10204</w:t>
-      </w:r>
-      <w:r>
-        <w:t xml:space="preserve">.</w:t>
+        <w:t xml:space="preserve">Journal of NeuroEngineering and Rehabilitation</w:t>
+      </w:r>
+      <w:r>
+        <w:t xml:space="preserve">, ahead of print.</w:t>
       </w:r>
       <w:r>
         <w:t xml:space="preserve"> </w:t>
@@ -1907,7 +1581,7 @@
           <w:rPr>
             <w:rStyle w:val="Hyperlink"/>
           </w:rPr>
-          <w:t xml:space="preserve">https://arxiv.org/abs/2006.10204</w:t>
+          <w:t xml:space="preserve">https://doi.org/10.1186/s12984-023-01186-9</w:t>
         </w:r>
       </w:hyperlink>
       <w:r>
@@ -1915,19 +1589,19 @@
       </w:r>
     </w:p>
     <w:bookmarkEnd w:id="28"/>
-    <w:bookmarkStart w:id="30" w:name="ref-cao2017realtime"/>
+    <w:bookmarkStart w:id="30" w:name="ref-xu2022vitpose"/>
     <w:p>
       <w:pPr>
         <w:pStyle w:val="Bibliography"/>
       </w:pPr>
       <w:r>
-        <w:t xml:space="preserve">Cao, Zhe, Tomas Simon, Shih-En Wei, and Yaser Sheikh. 2017.</w:t>
-      </w:r>
-      <w:r>
-        <w:t xml:space="preserve"> </w:t>
-      </w:r>
-      <w:r>
-        <w:t xml:space="preserve">“Realtime Multi-Person 2D Pose Estimation Using Part Affinity Fields.”</w:t>
+        <w:t xml:space="preserve">Xu, Yuliang, Weijian Wang, Tong Wang, et al. 2022.</w:t>
+      </w:r>
+      <w:r>
+        <w:t xml:space="preserve"> </w:t>
+      </w:r>
+      <w:r>
+        <w:t xml:space="preserve">“ViTPose: Simple Vision Transformer Baselines for Human Pose Estimation.”</w:t>
       </w:r>
       <w:r>
         <w:t xml:space="preserve"> </w:t>
@@ -1937,10 +1611,10 @@
           <w:i/>
           <w:iCs/>
         </w:rPr>
-        <w:t xml:space="preserve">Proceedings of the IEEE Conference on Computer Vision and Pattern Recognition (CVPR)</w:t>
-      </w:r>
-      <w:r>
-        <w:t xml:space="preserve">, 7291–99.</w:t>
+        <w:t xml:space="preserve">arXiv Preprint arXiv:2204.12484</w:t>
+      </w:r>
+      <w:r>
+        <w:t xml:space="preserve">.</w:t>
       </w:r>
       <w:r>
         <w:t xml:space="preserve"> </w:t>
@@ -1950,7 +1624,7 @@
           <w:rPr>
             <w:rStyle w:val="Hyperlink"/>
           </w:rPr>
-          <w:t xml:space="preserve">https://doi.org/10.1109/CVPR.2017.143</w:t>
+          <w:t xml:space="preserve">https://arxiv.org/abs/2204.12484</w:t>
         </w:r>
       </w:hyperlink>
       <w:r>
@@ -1958,31 +1632,19 @@
       </w:r>
     </w:p>
     <w:bookmarkEnd w:id="30"/>
-    <w:bookmarkStart w:id="32" w:name="ref-caterisano2002depth"/>
+    <w:bookmarkStart w:id="32" w:name="ref-zhou2023survey"/>
     <w:p>
       <w:pPr>
         <w:pStyle w:val="Bibliography"/>
       </w:pPr>
       <w:r>
-        <w:t xml:space="preserve">Caterisano, Anthony, Robert F. Moss, Thomas K. Pellinger, et al. 2002.</w:t>
-      </w:r>
-      <w:r>
-        <w:t xml:space="preserve"> </w:t>
-      </w:r>
-      <w:r>
-        <w:t xml:space="preserve">“The Effect of Back Squat Depth on the</w:t>
-      </w:r>
-      <w:r>
-        <w:t xml:space="preserve"> </w:t>
-      </w:r>
-      <w:r>
-        <w:t xml:space="preserve">EMG</w:t>
-      </w:r>
-      <w:r>
-        <w:t xml:space="preserve"> </w:t>
-      </w:r>
-      <w:r>
-        <w:t xml:space="preserve">Activity of 4 Superficial Hip and Thigh Muscles.”</w:t>
+        <w:t xml:space="preserve">Zhou, Lijuan, Xiang Meng, Zhihuan Liu, Mengqi Wu, Zhimin Gao, and Pichao Wang. 2023.</w:t>
+      </w:r>
+      <w:r>
+        <w:t xml:space="preserve"> </w:t>
+      </w:r>
+      <w:r>
+        <w:t xml:space="preserve">“Human Pose-Based Estimation, Tracking and Action Recognition with Deep Learning: A Survey.”</w:t>
       </w:r>
       <w:r>
         <w:t xml:space="preserve"> </w:t>
@@ -1992,13 +1654,10 @@
           <w:i/>
           <w:iCs/>
         </w:rPr>
-        <w:t xml:space="preserve">Journal of Strength and Conditioning Research</w:t>
-      </w:r>
-      <w:r>
-        <w:t xml:space="preserve"> </w:t>
-      </w:r>
-      <w:r>
-        <w:t xml:space="preserve">16 (3): 428–32.</w:t>
+        <w:t xml:space="preserve">arXiv Preprint arXiv:2310.13039</w:t>
+      </w:r>
+      <w:r>
+        <w:t xml:space="preserve">.</w:t>
       </w:r>
       <w:r>
         <w:t xml:space="preserve"> </w:t>
@@ -2008,7 +1667,7 @@
           <w:rPr>
             <w:rStyle w:val="Hyperlink"/>
           </w:rPr>
-          <w:t xml:space="preserve">https://doi.org/10.1519/00124278-200208000-00017</w:t>
+          <w:t xml:space="preserve">https://arxiv.org/abs/2310.13039</w:t>
         </w:r>
       </w:hyperlink>
       <w:r>
@@ -2016,189 +1675,8 @@
       </w:r>
     </w:p>
     <w:bookmarkEnd w:id="32"/>
-    <w:bookmarkStart w:id="34" w:name="ref-escamilla2010biomechanical"/>
-    <w:p>
-      <w:pPr>
-        <w:pStyle w:val="Bibliography"/>
-      </w:pPr>
-      <w:r>
-        <w:t xml:space="preserve">Escamilla, Rafael F. 2010.</w:t>
-      </w:r>
-      <w:r>
-        <w:t xml:space="preserve"> </w:t>
-      </w:r>
-      <w:r>
-        <w:t xml:space="preserve">“Biomechanical Analysis of the Squat.”</w:t>
-      </w:r>
-      <w:r>
-        <w:t xml:space="preserve"> </w:t>
-      </w:r>
-      <w:r>
-        <w:rPr>
-          <w:i/>
-          <w:iCs/>
-        </w:rPr>
-        <w:t xml:space="preserve">Journal of Strength and Conditioning Research</w:t>
-      </w:r>
-      <w:r>
-        <w:t xml:space="preserve"> </w:t>
-      </w:r>
-      <w:r>
-        <w:t xml:space="preserve">24 (12): 3497–506.</w:t>
-      </w:r>
-      <w:r>
-        <w:t xml:space="preserve"> </w:t>
-      </w:r>
-      <w:hyperlink r:id="rId33">
-        <w:r>
-          <w:rPr>
-            <w:rStyle w:val="Hyperlink"/>
-          </w:rPr>
-          <w:t xml:space="preserve">https://doi.org/10.1519/JSC.0b013e3181ddc88b</w:t>
-        </w:r>
-      </w:hyperlink>
-      <w:r>
-        <w:t xml:space="preserve">.</w:t>
-      </w:r>
-    </w:p>
+    <w:bookmarkEnd w:id="33"/>
     <w:bookmarkEnd w:id="34"/>
-    <w:bookmarkStart w:id="36" w:name="ref-hartmann2013analysis"/>
-    <w:p>
-      <w:pPr>
-        <w:pStyle w:val="Bibliography"/>
-      </w:pPr>
-      <w:r>
-        <w:t xml:space="preserve">Hartmann, Hagen, Klaus Wirth, Michael Klusemann, J. Dalic, C. Matuschek, and Dietmar Schmidtbleicher. 2013.</w:t>
-      </w:r>
-      <w:r>
-        <w:t xml:space="preserve"> </w:t>
-      </w:r>
-      <w:r>
-        <w:t xml:space="preserve">“Analysis of the Load on the Knee Joint and Vertebral Column with Changes in Squatting Depth and Weight Load.”</w:t>
-      </w:r>
-      <w:r>
-        <w:t xml:space="preserve"> </w:t>
-      </w:r>
-      <w:r>
-        <w:rPr>
-          <w:i/>
-          <w:iCs/>
-        </w:rPr>
-        <w:t xml:space="preserve">Sports Medicine</w:t>
-      </w:r>
-      <w:r>
-        <w:t xml:space="preserve"> </w:t>
-      </w:r>
-      <w:r>
-        <w:t xml:space="preserve">43 (10): 993–1008.</w:t>
-      </w:r>
-      <w:r>
-        <w:t xml:space="preserve"> </w:t>
-      </w:r>
-      <w:hyperlink r:id="rId35">
-        <w:r>
-          <w:rPr>
-            <w:rStyle w:val="Hyperlink"/>
-          </w:rPr>
-          <w:t xml:space="preserve">https://doi.org/10.1007/s40279-013-0073-6</w:t>
-        </w:r>
-      </w:hyperlink>
-      <w:r>
-        <w:t xml:space="preserve">.</w:t>
-      </w:r>
-    </w:p>
-    <w:bookmarkEnd w:id="36"/>
-    <w:bookmarkStart w:id="38" w:name="ref-lugaresi2019mediapipe"/>
-    <w:p>
-      <w:pPr>
-        <w:pStyle w:val="Bibliography"/>
-      </w:pPr>
-      <w:r>
-        <w:t xml:space="preserve">Lugaresi, Camillo, Jiuqiang Tang, Hartwig Nash, et al.</w:t>
-      </w:r>
-      <w:r>
-        <w:t xml:space="preserve"> 2019.</w:t>
-      </w:r>
-      <w:r>
-        <w:t xml:space="preserve"> </w:t>
-      </w:r>
-      <w:r>
-        <w:t xml:space="preserve">“MediaPipe: A Framework for Building Perception Pipelines.”</w:t>
-      </w:r>
-      <w:r>
-        <w:t xml:space="preserve"> </w:t>
-      </w:r>
-      <w:r>
-        <w:rPr>
-          <w:i/>
-          <w:iCs/>
-        </w:rPr>
-        <w:t xml:space="preserve">arXiv Preprint arXiv:1906.08172</w:t>
-      </w:r>
-      <w:r>
-        <w:t xml:space="preserve">.</w:t>
-      </w:r>
-      <w:r>
-        <w:t xml:space="preserve"> </w:t>
-      </w:r>
-      <w:hyperlink r:id="rId37">
-        <w:r>
-          <w:rPr>
-            <w:rStyle w:val="Hyperlink"/>
-          </w:rPr>
-          <w:t xml:space="preserve">https://arxiv.org/abs/1906.08172</w:t>
-        </w:r>
-      </w:hyperlink>
-      <w:r>
-        <w:t xml:space="preserve">.</w:t>
-      </w:r>
-    </w:p>
-    <w:bookmarkEnd w:id="38"/>
-    <w:bookmarkStart w:id="40" w:name="ref-wei2016cpm"/>
-    <w:p>
-      <w:pPr>
-        <w:pStyle w:val="Bibliography"/>
-      </w:pPr>
-      <w:r>
-        <w:t xml:space="preserve">Wei, Shih-En, Varun Ramakrishna, Takeo Kanade, and Yaser Sheikh. 2016.</w:t>
-      </w:r>
-      <w:r>
-        <w:t xml:space="preserve"> </w:t>
-      </w:r>
-      <w:r>
-        <w:t xml:space="preserve">“Convolutional Pose Machines.”</w:t>
-      </w:r>
-      <w:r>
-        <w:t xml:space="preserve"> </w:t>
-      </w:r>
-      <w:r>
-        <w:rPr>
-          <w:i/>
-          <w:iCs/>
-        </w:rPr>
-        <w:t xml:space="preserve">Proceedings of the IEEE Conference on Computer Vision and Pattern Recognition (CVPR)</w:t>
-      </w:r>
-      <w:r>
-        <w:t xml:space="preserve">, 4724–32.</w:t>
-      </w:r>
-      <w:r>
-        <w:t xml:space="preserve"> </w:t>
-      </w:r>
-      <w:hyperlink r:id="rId39">
-        <w:r>
-          <w:rPr>
-            <w:rStyle w:val="Hyperlink"/>
-          </w:rPr>
-          <w:t xml:space="preserve">https://doi.org/10.1109/CVPR.2016.472</w:t>
-        </w:r>
-      </w:hyperlink>
-      <w:r>
-        <w:t xml:space="preserve">.</w:t>
-      </w:r>
-    </w:p>
-    <w:bookmarkEnd w:id="40"/>
-    <w:bookmarkEnd w:id="41"/>
-    <w:bookmarkEnd w:id="42"/>
     <w:sectPr>
       <w:footnotePr>
         <w:numRestart w:val="eachSect"/>

</xml_diff>